<commit_message>
Actualiza memoria técnica (V.2): puntos GPS 3/13 y enlaces del visor en línea
Ajusta conteos y elevaciones de puntos GPS (Puerto López 3, El Volcán 13)
tras la actualización de los shapefiles, regenera las tablas de waypoints
y agrega los enlaces al visor en GitHub Pages y al repositorio.

Co-Authored-By: Claude Opus 4.8 <noreply@anthropic.com>
</commit_message>
<xml_diff>
--- a/MEMORIA_TECNICA_DIAPIRISMO_URABA.docx
+++ b/MEMORIA_TECNICA_DIAPIRISMO_URABA.docx
@@ -518,7 +518,7 @@
                 <w:sz w:val="20"/>
                 <w:szCs w:val="20"/>
               </w:rPr>
-              <w:t xml:space="preserve">V.1 (borrador) — octubre de 2026</w:t>
+              <w:t xml:space="preserve">V.2 (borrador) — octubre de 2026</w:t>
             </w:r>
           </w:p>
         </w:tc>
@@ -2670,7 +2670,7 @@
                 <w:sz w:val="19"/>
                 <w:szCs w:val="19"/>
               </w:rPr>
-              <w:t xml:space="preserve">5 (elevación 17–136 m s. n. m.)</w:t>
+              <w:t xml:space="preserve">3 (elevación 87–136 m s. n. m.)</w:t>
             </w:r>
           </w:p>
         </w:tc>
@@ -3185,7 +3185,7 @@
                 <w:sz w:val="19"/>
                 <w:szCs w:val="19"/>
               </w:rPr>
-              <w:t xml:space="preserve">15 (elevación 6–198 m s. n. m.)</w:t>
+              <w:t xml:space="preserve">13 (elevación 87–198 m s. n. m.)</w:t>
             </w:r>
           </w:p>
         </w:tc>
@@ -3970,7 +3970,7 @@
                 <w:sz w:val="20"/>
                 <w:szCs w:val="20"/>
               </w:rPr>
-              <w:t xml:space="preserve">5</w:t>
+              <w:t xml:space="preserve">3</w:t>
             </w:r>
           </w:p>
         </w:tc>
@@ -3995,7 +3995,7 @@
                 <w:sz w:val="20"/>
                 <w:szCs w:val="20"/>
               </w:rPr>
-              <w:t xml:space="preserve">15</w:t>
+              <w:t xml:space="preserve">13</w:t>
             </w:r>
           </w:p>
         </w:tc>
@@ -4831,7 +4831,7 @@
                 <w:sz w:val="18"/>
                 <w:szCs w:val="18"/>
               </w:rPr>
-              <w:t xml:space="preserve">13:21:04</w:t>
+              <w:t xml:space="preserve">15:55:00</w:t>
             </w:r>
           </w:p>
         </w:tc>
@@ -4856,7 +4856,7 @@
                 <w:sz w:val="18"/>
                 <w:szCs w:val="18"/>
               </w:rPr>
-              <w:t xml:space="preserve">7.817785</w:t>
+              <w:t xml:space="preserve">8.048921</w:t>
             </w:r>
           </w:p>
         </w:tc>
@@ -4881,7 +4881,7 @@
                 <w:sz w:val="18"/>
                 <w:szCs w:val="18"/>
               </w:rPr>
-              <w:t xml:space="preserve">-76.717373</w:t>
+              <w:t xml:space="preserve">-76.575037</w:t>
             </w:r>
           </w:p>
         </w:tc>
@@ -4907,7 +4907,7 @@
                 <w:sz w:val="18"/>
                 <w:szCs w:val="18"/>
               </w:rPr>
-              <w:t xml:space="preserve">18</w:t>
+              <w:t xml:space="preserve">87</w:t>
             </w:r>
           </w:p>
         </w:tc>
@@ -4985,7 +4985,7 @@
                 <w:sz w:val="18"/>
                 <w:szCs w:val="18"/>
               </w:rPr>
-              <w:t xml:space="preserve">15:55:00</w:t>
+              <w:t xml:space="preserve">16:07:33</w:t>
             </w:r>
           </w:p>
         </w:tc>
@@ -5010,7 +5010,7 @@
                 <w:sz w:val="18"/>
                 <w:szCs w:val="18"/>
               </w:rPr>
-              <w:t xml:space="preserve">8.048921</w:t>
+              <w:t xml:space="preserve">8.051187</w:t>
             </w:r>
           </w:p>
         </w:tc>
@@ -5035,7 +5035,7 @@
                 <w:sz w:val="18"/>
                 <w:szCs w:val="18"/>
               </w:rPr>
-              <w:t xml:space="preserve">-76.575037</w:t>
+              <w:t xml:space="preserve">-76.574492</w:t>
             </w:r>
           </w:p>
         </w:tc>
@@ -5061,7 +5061,7 @@
                 <w:sz w:val="18"/>
                 <w:szCs w:val="18"/>
               </w:rPr>
-              <w:t xml:space="preserve">87</w:t>
+              <w:t xml:space="preserve">102</w:t>
             </w:r>
           </w:p>
         </w:tc>
@@ -5139,7 +5139,7 @@
                 <w:sz w:val="18"/>
                 <w:szCs w:val="18"/>
               </w:rPr>
-              <w:t xml:space="preserve">16:07:33</w:t>
+              <w:t xml:space="preserve">16:51:27</w:t>
             </w:r>
           </w:p>
         </w:tc>
@@ -5164,7 +5164,7 @@
                 <w:sz w:val="18"/>
                 <w:szCs w:val="18"/>
               </w:rPr>
-              <w:t xml:space="preserve">8.051187</w:t>
+              <w:t xml:space="preserve">8.052143</w:t>
             </w:r>
           </w:p>
         </w:tc>
@@ -5189,7 +5189,7 @@
                 <w:sz w:val="18"/>
                 <w:szCs w:val="18"/>
               </w:rPr>
-              <w:t xml:space="preserve">-76.574492</w:t>
+              <w:t xml:space="preserve">-76.578096</w:t>
             </w:r>
           </w:p>
         </w:tc>
@@ -5215,315 +5215,7 @@
                 <w:sz w:val="18"/>
                 <w:szCs w:val="18"/>
               </w:rPr>
-              <w:t xml:space="preserve">102</w:t>
-            </w:r>
-          </w:p>
-        </w:tc>
-      </w:tr>
-      <w:tr>
-        <w:tc>
-          <w:tcPr>
-            <w:tcW w:type="dxa" w:w="700"/>
-            <w:tcMar>
-              <w:top w:type="dxa" w:w="60"/>
-              <w:left w:type="dxa" w:w="90"/>
-              <w:bottom w:type="dxa" w:w="60"/>
-              <w:right w:type="dxa" w:w="90"/>
-            </w:tcMar>
-            <w:vAlign w:val="center"/>
-          </w:tcPr>
-          <w:p>
-            <w:pPr>
-              <w:spacing w:after="0" w:line="260"/>
-              <w:jc w:val="center"/>
-            </w:pPr>
-            <w:r>
-              <w:rPr>
-                <w:rFonts w:ascii="Calibri" w:cs="Calibri" w:eastAsia="Calibri" w:hAnsi="Calibri"/>
-                <w:sz w:val="18"/>
-                <w:szCs w:val="18"/>
-              </w:rPr>
-              <w:t xml:space="preserve">4</w:t>
-            </w:r>
-          </w:p>
-        </w:tc>
-        <w:tc>
-          <w:tcPr>
-            <w:tcW w:type="dxa" w:w="1900"/>
-            <w:tcMar>
-              <w:top w:type="dxa" w:w="60"/>
-              <w:left w:type="dxa" w:w="90"/>
-              <w:bottom w:type="dxa" w:w="60"/>
-              <w:right w:type="dxa" w:w="90"/>
-            </w:tcMar>
-            <w:vAlign w:val="center"/>
-          </w:tcPr>
-          <w:p>
-            <w:pPr>
-              <w:spacing w:after="0" w:line="260"/>
-            </w:pPr>
-            <w:r>
-              <w:rPr>
-                <w:rFonts w:ascii="Calibri" w:cs="Calibri" w:eastAsia="Calibri" w:hAnsi="Calibri"/>
-                <w:sz w:val="18"/>
-                <w:szCs w:val="18"/>
-              </w:rPr>
-              <w:t xml:space="preserve">2026-10-11</w:t>
-            </w:r>
-          </w:p>
-        </w:tc>
-        <w:tc>
-          <w:tcPr>
-            <w:tcW w:type="dxa" w:w="1900"/>
-            <w:tcMar>
-              <w:top w:type="dxa" w:w="60"/>
-              <w:left w:type="dxa" w:w="90"/>
-              <w:bottom w:type="dxa" w:w="60"/>
-              <w:right w:type="dxa" w:w="90"/>
-            </w:tcMar>
-            <w:vAlign w:val="center"/>
-          </w:tcPr>
-          <w:p>
-            <w:pPr>
-              <w:spacing w:after="0" w:line="260"/>
-            </w:pPr>
-            <w:r>
-              <w:rPr>
-                <w:rFonts w:ascii="Calibri" w:cs="Calibri" w:eastAsia="Calibri" w:hAnsi="Calibri"/>
-                <w:sz w:val="18"/>
-                <w:szCs w:val="18"/>
-              </w:rPr>
-              <w:t xml:space="preserve">16:51:27</w:t>
-            </w:r>
-          </w:p>
-        </w:tc>
-        <w:tc>
-          <w:tcPr>
-            <w:tcW w:type="dxa" w:w="2300"/>
-            <w:tcMar>
-              <w:top w:type="dxa" w:w="60"/>
-              <w:left w:type="dxa" w:w="90"/>
-              <w:bottom w:type="dxa" w:w="60"/>
-              <w:right w:type="dxa" w:w="90"/>
-            </w:tcMar>
-            <w:vAlign w:val="center"/>
-          </w:tcPr>
-          <w:p>
-            <w:pPr>
-              <w:spacing w:after="0" w:line="260"/>
-            </w:pPr>
-            <w:r>
-              <w:rPr>
-                <w:rFonts w:ascii="Calibri" w:cs="Calibri" w:eastAsia="Calibri" w:hAnsi="Calibri"/>
-                <w:sz w:val="18"/>
-                <w:szCs w:val="18"/>
-              </w:rPr>
-              <w:t xml:space="preserve">8.052143</w:t>
-            </w:r>
-          </w:p>
-        </w:tc>
-        <w:tc>
-          <w:tcPr>
-            <w:tcW w:type="dxa" w:w="2300"/>
-            <w:tcMar>
-              <w:top w:type="dxa" w:w="60"/>
-              <w:left w:type="dxa" w:w="90"/>
-              <w:bottom w:type="dxa" w:w="60"/>
-              <w:right w:type="dxa" w:w="90"/>
-            </w:tcMar>
-            <w:vAlign w:val="center"/>
-          </w:tcPr>
-          <w:p>
-            <w:pPr>
-              <w:spacing w:after="0" w:line="260"/>
-            </w:pPr>
-            <w:r>
-              <w:rPr>
-                <w:rFonts w:ascii="Calibri" w:cs="Calibri" w:eastAsia="Calibri" w:hAnsi="Calibri"/>
-                <w:sz w:val="18"/>
-                <w:szCs w:val="18"/>
-              </w:rPr>
-              <w:t xml:space="preserve">-76.578096</w:t>
-            </w:r>
-          </w:p>
-        </w:tc>
-        <w:tc>
-          <w:tcPr>
-            <w:tcW w:type="dxa" w:w="1300"/>
-            <w:tcMar>
-              <w:top w:type="dxa" w:w="60"/>
-              <w:left w:type="dxa" w:w="90"/>
-              <w:bottom w:type="dxa" w:w="60"/>
-              <w:right w:type="dxa" w:w="90"/>
-            </w:tcMar>
-            <w:vAlign w:val="center"/>
-          </w:tcPr>
-          <w:p>
-            <w:pPr>
-              <w:spacing w:after="0" w:line="260"/>
-              <w:jc w:val="center"/>
-            </w:pPr>
-            <w:r>
-              <w:rPr>
-                <w:rFonts w:ascii="Calibri" w:cs="Calibri" w:eastAsia="Calibri" w:hAnsi="Calibri"/>
-                <w:sz w:val="18"/>
-                <w:szCs w:val="18"/>
-              </w:rPr>
               <w:t xml:space="preserve">136</w:t>
-            </w:r>
-          </w:p>
-        </w:tc>
-      </w:tr>
-      <w:tr>
-        <w:tc>
-          <w:tcPr>
-            <w:tcW w:type="dxa" w:w="700"/>
-            <w:tcMar>
-              <w:top w:type="dxa" w:w="60"/>
-              <w:left w:type="dxa" w:w="90"/>
-              <w:bottom w:type="dxa" w:w="60"/>
-              <w:right w:type="dxa" w:w="90"/>
-            </w:tcMar>
-            <w:vAlign w:val="center"/>
-          </w:tcPr>
-          <w:p>
-            <w:pPr>
-              <w:spacing w:after="0" w:line="260"/>
-              <w:jc w:val="center"/>
-            </w:pPr>
-            <w:r>
-              <w:rPr>
-                <w:rFonts w:ascii="Calibri" w:cs="Calibri" w:eastAsia="Calibri" w:hAnsi="Calibri"/>
-                <w:sz w:val="18"/>
-                <w:szCs w:val="18"/>
-              </w:rPr>
-              <w:t xml:space="preserve">5</w:t>
-            </w:r>
-          </w:p>
-        </w:tc>
-        <w:tc>
-          <w:tcPr>
-            <w:tcW w:type="dxa" w:w="1900"/>
-            <w:tcMar>
-              <w:top w:type="dxa" w:w="60"/>
-              <w:left w:type="dxa" w:w="90"/>
-              <w:bottom w:type="dxa" w:w="60"/>
-              <w:right w:type="dxa" w:w="90"/>
-            </w:tcMar>
-            <w:vAlign w:val="center"/>
-          </w:tcPr>
-          <w:p>
-            <w:pPr>
-              <w:spacing w:after="0" w:line="260"/>
-            </w:pPr>
-            <w:r>
-              <w:rPr>
-                <w:rFonts w:ascii="Calibri" w:cs="Calibri" w:eastAsia="Calibri" w:hAnsi="Calibri"/>
-                <w:sz w:val="18"/>
-                <w:szCs w:val="18"/>
-              </w:rPr>
-              <w:t xml:space="preserve">2026-10-11</w:t>
-            </w:r>
-          </w:p>
-        </w:tc>
-        <w:tc>
-          <w:tcPr>
-            <w:tcW w:type="dxa" w:w="1900"/>
-            <w:tcMar>
-              <w:top w:type="dxa" w:w="60"/>
-              <w:left w:type="dxa" w:w="90"/>
-              <w:bottom w:type="dxa" w:w="60"/>
-              <w:right w:type="dxa" w:w="90"/>
-            </w:tcMar>
-            <w:vAlign w:val="center"/>
-          </w:tcPr>
-          <w:p>
-            <w:pPr>
-              <w:spacing w:after="0" w:line="260"/>
-            </w:pPr>
-            <w:r>
-              <w:rPr>
-                <w:rFonts w:ascii="Calibri" w:cs="Calibri" w:eastAsia="Calibri" w:hAnsi="Calibri"/>
-                <w:sz w:val="18"/>
-                <w:szCs w:val="18"/>
-              </w:rPr>
-              <w:t xml:space="preserve">18:15:58</w:t>
-            </w:r>
-          </w:p>
-        </w:tc>
-        <w:tc>
-          <w:tcPr>
-            <w:tcW w:type="dxa" w:w="2300"/>
-            <w:tcMar>
-              <w:top w:type="dxa" w:w="60"/>
-              <w:left w:type="dxa" w:w="90"/>
-              <w:bottom w:type="dxa" w:w="60"/>
-              <w:right w:type="dxa" w:w="90"/>
-            </w:tcMar>
-            <w:vAlign w:val="center"/>
-          </w:tcPr>
-          <w:p>
-            <w:pPr>
-              <w:spacing w:after="0" w:line="260"/>
-            </w:pPr>
-            <w:r>
-              <w:rPr>
-                <w:rFonts w:ascii="Calibri" w:cs="Calibri" w:eastAsia="Calibri" w:hAnsi="Calibri"/>
-                <w:sz w:val="18"/>
-                <w:szCs w:val="18"/>
-              </w:rPr>
-              <w:t xml:space="preserve">8.096793</w:t>
-            </w:r>
-          </w:p>
-        </w:tc>
-        <w:tc>
-          <w:tcPr>
-            <w:tcW w:type="dxa" w:w="2300"/>
-            <w:tcMar>
-              <w:top w:type="dxa" w:w="60"/>
-              <w:left w:type="dxa" w:w="90"/>
-              <w:bottom w:type="dxa" w:w="60"/>
-              <w:right w:type="dxa" w:w="90"/>
-            </w:tcMar>
-            <w:vAlign w:val="center"/>
-          </w:tcPr>
-          <w:p>
-            <w:pPr>
-              <w:spacing w:after="0" w:line="260"/>
-            </w:pPr>
-            <w:r>
-              <w:rPr>
-                <w:rFonts w:ascii="Calibri" w:cs="Calibri" w:eastAsia="Calibri" w:hAnsi="Calibri"/>
-                <w:sz w:val="18"/>
-                <w:szCs w:val="18"/>
-              </w:rPr>
-              <w:t xml:space="preserve">-76.724000</w:t>
-            </w:r>
-          </w:p>
-        </w:tc>
-        <w:tc>
-          <w:tcPr>
-            <w:tcW w:type="dxa" w:w="1300"/>
-            <w:tcMar>
-              <w:top w:type="dxa" w:w="60"/>
-              <w:left w:type="dxa" w:w="90"/>
-              <w:bottom w:type="dxa" w:w="60"/>
-              <w:right w:type="dxa" w:w="90"/>
-            </w:tcMar>
-            <w:vAlign w:val="center"/>
-          </w:tcPr>
-          <w:p>
-            <w:pPr>
-              <w:spacing w:after="0" w:line="260"/>
-              <w:jc w:val="center"/>
-            </w:pPr>
-            <w:r>
-              <w:rPr>
-                <w:rFonts w:ascii="Calibri" w:cs="Calibri" w:eastAsia="Calibri" w:hAnsi="Calibri"/>
-                <w:sz w:val="18"/>
-                <w:szCs w:val="18"/>
-              </w:rPr>
-              <w:t xml:space="preserve">17</w:t>
             </w:r>
           </w:p>
         </w:tc>
@@ -5820,7 +5512,7 @@
                 <w:sz w:val="18"/>
                 <w:szCs w:val="18"/>
               </w:rPr>
-              <w:t xml:space="preserve">07:28:27</w:t>
+              <w:t xml:space="preserve">09:12:19</w:t>
             </w:r>
           </w:p>
         </w:tc>
@@ -5845,7 +5537,7 @@
                 <w:sz w:val="18"/>
                 <w:szCs w:val="18"/>
               </w:rPr>
-              <w:t xml:space="preserve">8.412619</w:t>
+              <w:t xml:space="preserve">8.384989</w:t>
             </w:r>
           </w:p>
         </w:tc>
@@ -5870,7 +5562,7 @@
                 <w:sz w:val="18"/>
                 <w:szCs w:val="18"/>
               </w:rPr>
-              <w:t xml:space="preserve">-76.754832</w:t>
+              <w:t xml:space="preserve">-76.643034</w:t>
             </w:r>
           </w:p>
         </w:tc>
@@ -5896,7 +5588,7 @@
                 <w:sz w:val="18"/>
                 <w:szCs w:val="18"/>
               </w:rPr>
-              <w:t xml:space="preserve">6</w:t>
+              <w:t xml:space="preserve">100</w:t>
             </w:r>
           </w:p>
         </w:tc>
@@ -5974,7 +5666,7 @@
                 <w:sz w:val="18"/>
                 <w:szCs w:val="18"/>
               </w:rPr>
-              <w:t xml:space="preserve">09:12:19</w:t>
+              <w:t xml:space="preserve">10:01:07</w:t>
             </w:r>
           </w:p>
         </w:tc>
@@ -5999,7 +5691,7 @@
                 <w:sz w:val="18"/>
                 <w:szCs w:val="18"/>
               </w:rPr>
-              <w:t xml:space="preserve">8.384989</w:t>
+              <w:t xml:space="preserve">8.383534</w:t>
             </w:r>
           </w:p>
         </w:tc>
@@ -6024,7 +5716,7 @@
                 <w:sz w:val="18"/>
                 <w:szCs w:val="18"/>
               </w:rPr>
-              <w:t xml:space="preserve">-76.643034</w:t>
+              <w:t xml:space="preserve">-76.643017</w:t>
             </w:r>
           </w:p>
         </w:tc>
@@ -6050,7 +5742,7 @@
                 <w:sz w:val="18"/>
                 <w:szCs w:val="18"/>
               </w:rPr>
-              <w:t xml:space="preserve">100</w:t>
+              <w:t xml:space="preserve">87</w:t>
             </w:r>
           </w:p>
         </w:tc>
@@ -6128,7 +5820,7 @@
                 <w:sz w:val="18"/>
                 <w:szCs w:val="18"/>
               </w:rPr>
-              <w:t xml:space="preserve">10:01:07</w:t>
+              <w:t xml:space="preserve">10:04:57</w:t>
             </w:r>
           </w:p>
         </w:tc>
@@ -6153,7 +5845,7 @@
                 <w:sz w:val="18"/>
                 <w:szCs w:val="18"/>
               </w:rPr>
-              <w:t xml:space="preserve">8.383534</w:t>
+              <w:t xml:space="preserve">8.383077</w:t>
             </w:r>
           </w:p>
         </w:tc>
@@ -6178,7 +5870,7 @@
                 <w:sz w:val="18"/>
                 <w:szCs w:val="18"/>
               </w:rPr>
-              <w:t xml:space="preserve">-76.643017</w:t>
+              <w:t xml:space="preserve">-76.643049</w:t>
             </w:r>
           </w:p>
         </w:tc>
@@ -6204,7 +5896,7 @@
                 <w:sz w:val="18"/>
                 <w:szCs w:val="18"/>
               </w:rPr>
-              <w:t xml:space="preserve">87</w:t>
+              <w:t xml:space="preserve">96</w:t>
             </w:r>
           </w:p>
         </w:tc>
@@ -6282,7 +5974,7 @@
                 <w:sz w:val="18"/>
                 <w:szCs w:val="18"/>
               </w:rPr>
-              <w:t xml:space="preserve">10:04:57</w:t>
+              <w:t xml:space="preserve">10:10:09</w:t>
             </w:r>
           </w:p>
         </w:tc>
@@ -6307,7 +5999,7 @@
                 <w:sz w:val="18"/>
                 <w:szCs w:val="18"/>
               </w:rPr>
-              <w:t xml:space="preserve">8.383077</w:t>
+              <w:t xml:space="preserve">8.382149</w:t>
             </w:r>
           </w:p>
         </w:tc>
@@ -6332,7 +6024,7 @@
                 <w:sz w:val="18"/>
                 <w:szCs w:val="18"/>
               </w:rPr>
-              <w:t xml:space="preserve">-76.643049</w:t>
+              <w:t xml:space="preserve">-76.642290</w:t>
             </w:r>
           </w:p>
         </w:tc>
@@ -6358,7 +6050,7 @@
                 <w:sz w:val="18"/>
                 <w:szCs w:val="18"/>
               </w:rPr>
-              <w:t xml:space="preserve">96</w:t>
+              <w:t xml:space="preserve">114</w:t>
             </w:r>
           </w:p>
         </w:tc>
@@ -6436,7 +6128,7 @@
                 <w:sz w:val="18"/>
                 <w:szCs w:val="18"/>
               </w:rPr>
-              <w:t xml:space="preserve">10:10:09</w:t>
+              <w:t xml:space="preserve">10:13:47</w:t>
             </w:r>
           </w:p>
         </w:tc>
@@ -6461,7 +6153,7 @@
                 <w:sz w:val="18"/>
                 <w:szCs w:val="18"/>
               </w:rPr>
-              <w:t xml:space="preserve">8.382149</w:t>
+              <w:t xml:space="preserve">8.381135</w:t>
             </w:r>
           </w:p>
         </w:tc>
@@ -6486,7 +6178,7 @@
                 <w:sz w:val="18"/>
                 <w:szCs w:val="18"/>
               </w:rPr>
-              <w:t xml:space="preserve">-76.642290</w:t>
+              <w:t xml:space="preserve">-76.641969</w:t>
             </w:r>
           </w:p>
         </w:tc>
@@ -6512,7 +6204,7 @@
                 <w:sz w:val="18"/>
                 <w:szCs w:val="18"/>
               </w:rPr>
-              <w:t xml:space="preserve">114</w:t>
+              <w:t xml:space="preserve">123</w:t>
             </w:r>
           </w:p>
         </w:tc>
@@ -6590,7 +6282,7 @@
                 <w:sz w:val="18"/>
                 <w:szCs w:val="18"/>
               </w:rPr>
-              <w:t xml:space="preserve">10:13:47</w:t>
+              <w:t xml:space="preserve">10:24:40</w:t>
             </w:r>
           </w:p>
         </w:tc>
@@ -6615,7 +6307,7 @@
                 <w:sz w:val="18"/>
                 <w:szCs w:val="18"/>
               </w:rPr>
-              <w:t xml:space="preserve">8.381135</w:t>
+              <w:t xml:space="preserve">8.380408</w:t>
             </w:r>
           </w:p>
         </w:tc>
@@ -6640,7 +6332,7 @@
                 <w:sz w:val="18"/>
                 <w:szCs w:val="18"/>
               </w:rPr>
-              <w:t xml:space="preserve">-76.641969</w:t>
+              <w:t xml:space="preserve">-76.641477</w:t>
             </w:r>
           </w:p>
         </w:tc>
@@ -6666,7 +6358,7 @@
                 <w:sz w:val="18"/>
                 <w:szCs w:val="18"/>
               </w:rPr>
-              <w:t xml:space="preserve">123</w:t>
+              <w:t xml:space="preserve">132</w:t>
             </w:r>
           </w:p>
         </w:tc>
@@ -6744,7 +6436,7 @@
                 <w:sz w:val="18"/>
                 <w:szCs w:val="18"/>
               </w:rPr>
-              <w:t xml:space="preserve">10:24:40</w:t>
+              <w:t xml:space="preserve">10:26:21</w:t>
             </w:r>
           </w:p>
         </w:tc>
@@ -6769,7 +6461,7 @@
                 <w:sz w:val="18"/>
                 <w:szCs w:val="18"/>
               </w:rPr>
-              <w:t xml:space="preserve">8.380408</w:t>
+              <w:t xml:space="preserve">8.380430</w:t>
             </w:r>
           </w:p>
         </w:tc>
@@ -6794,7 +6486,7 @@
                 <w:sz w:val="18"/>
                 <w:szCs w:val="18"/>
               </w:rPr>
-              <w:t xml:space="preserve">-76.641477</w:t>
+              <w:t xml:space="preserve">-76.641309</w:t>
             </w:r>
           </w:p>
         </w:tc>
@@ -6820,7 +6512,7 @@
                 <w:sz w:val="18"/>
                 <w:szCs w:val="18"/>
               </w:rPr>
-              <w:t xml:space="preserve">132</w:t>
+              <w:t xml:space="preserve">136</w:t>
             </w:r>
           </w:p>
         </w:tc>
@@ -6898,7 +6590,7 @@
                 <w:sz w:val="18"/>
                 <w:szCs w:val="18"/>
               </w:rPr>
-              <w:t xml:space="preserve">10:26:21</w:t>
+              <w:t xml:space="preserve">10:28:24</w:t>
             </w:r>
           </w:p>
         </w:tc>
@@ -6923,7 +6615,7 @@
                 <w:sz w:val="18"/>
                 <w:szCs w:val="18"/>
               </w:rPr>
-              <w:t xml:space="preserve">8.380430</w:t>
+              <w:t xml:space="preserve">8.380382</w:t>
             </w:r>
           </w:p>
         </w:tc>
@@ -6948,7 +6640,7 @@
                 <w:sz w:val="18"/>
                 <w:szCs w:val="18"/>
               </w:rPr>
-              <w:t xml:space="preserve">-76.641309</w:t>
+              <w:t xml:space="preserve">-76.641127</w:t>
             </w:r>
           </w:p>
         </w:tc>
@@ -6974,7 +6666,7 @@
                 <w:sz w:val="18"/>
                 <w:szCs w:val="18"/>
               </w:rPr>
-              <w:t xml:space="preserve">136</w:t>
+              <w:t xml:space="preserve">138</w:t>
             </w:r>
           </w:p>
         </w:tc>
@@ -7052,7 +6744,7 @@
                 <w:sz w:val="18"/>
                 <w:szCs w:val="18"/>
               </w:rPr>
-              <w:t xml:space="preserve">10:28:24</w:t>
+              <w:t xml:space="preserve">11:13:22</w:t>
             </w:r>
           </w:p>
         </w:tc>
@@ -7077,7 +6769,7 @@
                 <w:sz w:val="18"/>
                 <w:szCs w:val="18"/>
               </w:rPr>
-              <w:t xml:space="preserve">8.380382</w:t>
+              <w:t xml:space="preserve">8.379627</w:t>
             </w:r>
           </w:p>
         </w:tc>
@@ -7102,7 +6794,7 @@
                 <w:sz w:val="18"/>
                 <w:szCs w:val="18"/>
               </w:rPr>
-              <w:t xml:space="preserve">-76.641127</w:t>
+              <w:t xml:space="preserve">-76.639724</w:t>
             </w:r>
           </w:p>
         </w:tc>
@@ -7128,7 +6820,7 @@
                 <w:sz w:val="18"/>
                 <w:szCs w:val="18"/>
               </w:rPr>
-              <w:t xml:space="preserve">138</w:t>
+              <w:t xml:space="preserve">151</w:t>
             </w:r>
           </w:p>
         </w:tc>
@@ -7206,7 +6898,7 @@
                 <w:sz w:val="18"/>
                 <w:szCs w:val="18"/>
               </w:rPr>
-              <w:t xml:space="preserve">11:13:22</w:t>
+              <w:t xml:space="preserve">11:58:59</w:t>
             </w:r>
           </w:p>
         </w:tc>
@@ -7231,7 +6923,7 @@
                 <w:sz w:val="18"/>
                 <w:szCs w:val="18"/>
               </w:rPr>
-              <w:t xml:space="preserve">8.379627</w:t>
+              <w:t xml:space="preserve">8.375895</w:t>
             </w:r>
           </w:p>
         </w:tc>
@@ -7256,7 +6948,7 @@
                 <w:sz w:val="18"/>
                 <w:szCs w:val="18"/>
               </w:rPr>
-              <w:t xml:space="preserve">-76.639724</w:t>
+              <w:t xml:space="preserve">-76.635416</w:t>
             </w:r>
           </w:p>
         </w:tc>
@@ -7282,7 +6974,7 @@
                 <w:sz w:val="18"/>
                 <w:szCs w:val="18"/>
               </w:rPr>
-              <w:t xml:space="preserve">151</w:t>
+              <w:t xml:space="preserve">198</w:t>
             </w:r>
           </w:p>
         </w:tc>
@@ -7360,7 +7052,7 @@
                 <w:sz w:val="18"/>
                 <w:szCs w:val="18"/>
               </w:rPr>
-              <w:t xml:space="preserve">11:58:59</w:t>
+              <w:t xml:space="preserve">12:00:42</w:t>
             </w:r>
           </w:p>
         </w:tc>
@@ -7385,7 +7077,7 @@
                 <w:sz w:val="18"/>
                 <w:szCs w:val="18"/>
               </w:rPr>
-              <w:t xml:space="preserve">8.375895</w:t>
+              <w:t xml:space="preserve">8.375546</w:t>
             </w:r>
           </w:p>
         </w:tc>
@@ -7410,7 +7102,7 @@
                 <w:sz w:val="18"/>
                 <w:szCs w:val="18"/>
               </w:rPr>
-              <w:t xml:space="preserve">-76.635416</w:t>
+              <w:t xml:space="preserve">-76.635211</w:t>
             </w:r>
           </w:p>
         </w:tc>
@@ -7436,7 +7128,7 @@
                 <w:sz w:val="18"/>
                 <w:szCs w:val="18"/>
               </w:rPr>
-              <w:t xml:space="preserve">198</w:t>
+              <w:t xml:space="preserve">197</w:t>
             </w:r>
           </w:p>
         </w:tc>
@@ -7514,7 +7206,7 @@
                 <w:sz w:val="18"/>
                 <w:szCs w:val="18"/>
               </w:rPr>
-              <w:t xml:space="preserve">12:00:42</w:t>
+              <w:t xml:space="preserve">12:04:03</w:t>
             </w:r>
           </w:p>
         </w:tc>
@@ -7539,7 +7231,7 @@
                 <w:sz w:val="18"/>
                 <w:szCs w:val="18"/>
               </w:rPr>
-              <w:t xml:space="preserve">8.375546</w:t>
+              <w:t xml:space="preserve">8.374973</w:t>
             </w:r>
           </w:p>
         </w:tc>
@@ -7564,7 +7256,7 @@
                 <w:sz w:val="18"/>
                 <w:szCs w:val="18"/>
               </w:rPr>
-              <w:t xml:space="preserve">-76.635211</w:t>
+              <w:t xml:space="preserve">-76.635426</w:t>
             </w:r>
           </w:p>
         </w:tc>
@@ -7590,7 +7282,7 @@
                 <w:sz w:val="18"/>
                 <w:szCs w:val="18"/>
               </w:rPr>
-              <w:t xml:space="preserve">197</w:t>
+              <w:t xml:space="preserve">192</w:t>
             </w:r>
           </w:p>
         </w:tc>
@@ -7668,7 +7360,7 @@
                 <w:sz w:val="18"/>
                 <w:szCs w:val="18"/>
               </w:rPr>
-              <w:t xml:space="preserve">12:04:03</w:t>
+              <w:t xml:space="preserve">12:05:24</w:t>
             </w:r>
           </w:p>
         </w:tc>
@@ -7693,7 +7385,7 @@
                 <w:sz w:val="18"/>
                 <w:szCs w:val="18"/>
               </w:rPr>
-              <w:t xml:space="preserve">8.374973</w:t>
+              <w:t xml:space="preserve">8.375089</w:t>
             </w:r>
           </w:p>
         </w:tc>
@@ -7718,7 +7410,7 @@
                 <w:sz w:val="18"/>
                 <w:szCs w:val="18"/>
               </w:rPr>
-              <w:t xml:space="preserve">-76.635426</w:t>
+              <w:t xml:space="preserve">-76.635637</w:t>
             </w:r>
           </w:p>
         </w:tc>
@@ -7744,315 +7436,7 @@
                 <w:sz w:val="18"/>
                 <w:szCs w:val="18"/>
               </w:rPr>
-              <w:t xml:space="preserve">192</w:t>
-            </w:r>
-          </w:p>
-        </w:tc>
-      </w:tr>
-      <w:tr>
-        <w:tc>
-          <w:tcPr>
-            <w:tcW w:type="dxa" w:w="700"/>
-            <w:tcMar>
-              <w:top w:type="dxa" w:w="60"/>
-              <w:left w:type="dxa" w:w="90"/>
-              <w:bottom w:type="dxa" w:w="60"/>
-              <w:right w:type="dxa" w:w="90"/>
-            </w:tcMar>
-            <w:vAlign w:val="center"/>
-          </w:tcPr>
-          <w:p>
-            <w:pPr>
-              <w:spacing w:after="0" w:line="260"/>
-              <w:jc w:val="center"/>
-            </w:pPr>
-            <w:r>
-              <w:rPr>
-                <w:rFonts w:ascii="Calibri" w:cs="Calibri" w:eastAsia="Calibri" w:hAnsi="Calibri"/>
-                <w:sz w:val="18"/>
-                <w:szCs w:val="18"/>
-              </w:rPr>
-              <w:t xml:space="preserve">14</w:t>
-            </w:r>
-          </w:p>
-        </w:tc>
-        <w:tc>
-          <w:tcPr>
-            <w:tcW w:type="dxa" w:w="1900"/>
-            <w:tcMar>
-              <w:top w:type="dxa" w:w="60"/>
-              <w:left w:type="dxa" w:w="90"/>
-              <w:bottom w:type="dxa" w:w="60"/>
-              <w:right w:type="dxa" w:w="90"/>
-            </w:tcMar>
-            <w:vAlign w:val="center"/>
-          </w:tcPr>
-          <w:p>
-            <w:pPr>
-              <w:spacing w:after="0" w:line="260"/>
-            </w:pPr>
-            <w:r>
-              <w:rPr>
-                <w:rFonts w:ascii="Calibri" w:cs="Calibri" w:eastAsia="Calibri" w:hAnsi="Calibri"/>
-                <w:sz w:val="18"/>
-                <w:szCs w:val="18"/>
-              </w:rPr>
-              <w:t xml:space="preserve">2026-10-12</w:t>
-            </w:r>
-          </w:p>
-        </w:tc>
-        <w:tc>
-          <w:tcPr>
-            <w:tcW w:type="dxa" w:w="1900"/>
-            <w:tcMar>
-              <w:top w:type="dxa" w:w="60"/>
-              <w:left w:type="dxa" w:w="90"/>
-              <w:bottom w:type="dxa" w:w="60"/>
-              <w:right w:type="dxa" w:w="90"/>
-            </w:tcMar>
-            <w:vAlign w:val="center"/>
-          </w:tcPr>
-          <w:p>
-            <w:pPr>
-              <w:spacing w:after="0" w:line="260"/>
-            </w:pPr>
-            <w:r>
-              <w:rPr>
-                <w:rFonts w:ascii="Calibri" w:cs="Calibri" w:eastAsia="Calibri" w:hAnsi="Calibri"/>
-                <w:sz w:val="18"/>
-                <w:szCs w:val="18"/>
-              </w:rPr>
-              <w:t xml:space="preserve">12:05:24</w:t>
-            </w:r>
-          </w:p>
-        </w:tc>
-        <w:tc>
-          <w:tcPr>
-            <w:tcW w:type="dxa" w:w="2300"/>
-            <w:tcMar>
-              <w:top w:type="dxa" w:w="60"/>
-              <w:left w:type="dxa" w:w="90"/>
-              <w:bottom w:type="dxa" w:w="60"/>
-              <w:right w:type="dxa" w:w="90"/>
-            </w:tcMar>
-            <w:vAlign w:val="center"/>
-          </w:tcPr>
-          <w:p>
-            <w:pPr>
-              <w:spacing w:after="0" w:line="260"/>
-            </w:pPr>
-            <w:r>
-              <w:rPr>
-                <w:rFonts w:ascii="Calibri" w:cs="Calibri" w:eastAsia="Calibri" w:hAnsi="Calibri"/>
-                <w:sz w:val="18"/>
-                <w:szCs w:val="18"/>
-              </w:rPr>
-              <w:t xml:space="preserve">8.375089</w:t>
-            </w:r>
-          </w:p>
-        </w:tc>
-        <w:tc>
-          <w:tcPr>
-            <w:tcW w:type="dxa" w:w="2300"/>
-            <w:tcMar>
-              <w:top w:type="dxa" w:w="60"/>
-              <w:left w:type="dxa" w:w="90"/>
-              <w:bottom w:type="dxa" w:w="60"/>
-              <w:right w:type="dxa" w:w="90"/>
-            </w:tcMar>
-            <w:vAlign w:val="center"/>
-          </w:tcPr>
-          <w:p>
-            <w:pPr>
-              <w:spacing w:after="0" w:line="260"/>
-            </w:pPr>
-            <w:r>
-              <w:rPr>
-                <w:rFonts w:ascii="Calibri" w:cs="Calibri" w:eastAsia="Calibri" w:hAnsi="Calibri"/>
-                <w:sz w:val="18"/>
-                <w:szCs w:val="18"/>
-              </w:rPr>
-              <w:t xml:space="preserve">-76.635637</w:t>
-            </w:r>
-          </w:p>
-        </w:tc>
-        <w:tc>
-          <w:tcPr>
-            <w:tcW w:type="dxa" w:w="1300"/>
-            <w:tcMar>
-              <w:top w:type="dxa" w:w="60"/>
-              <w:left w:type="dxa" w:w="90"/>
-              <w:bottom w:type="dxa" w:w="60"/>
-              <w:right w:type="dxa" w:w="90"/>
-            </w:tcMar>
-            <w:vAlign w:val="center"/>
-          </w:tcPr>
-          <w:p>
-            <w:pPr>
-              <w:spacing w:after="0" w:line="260"/>
-              <w:jc w:val="center"/>
-            </w:pPr>
-            <w:r>
-              <w:rPr>
-                <w:rFonts w:ascii="Calibri" w:cs="Calibri" w:eastAsia="Calibri" w:hAnsi="Calibri"/>
-                <w:sz w:val="18"/>
-                <w:szCs w:val="18"/>
-              </w:rPr>
               <w:t xml:space="preserve">191</w:t>
-            </w:r>
-          </w:p>
-        </w:tc>
-      </w:tr>
-      <w:tr>
-        <w:tc>
-          <w:tcPr>
-            <w:tcW w:type="dxa" w:w="700"/>
-            <w:tcMar>
-              <w:top w:type="dxa" w:w="60"/>
-              <w:left w:type="dxa" w:w="90"/>
-              <w:bottom w:type="dxa" w:w="60"/>
-              <w:right w:type="dxa" w:w="90"/>
-            </w:tcMar>
-            <w:vAlign w:val="center"/>
-          </w:tcPr>
-          <w:p>
-            <w:pPr>
-              <w:spacing w:after="0" w:line="260"/>
-              <w:jc w:val="center"/>
-            </w:pPr>
-            <w:r>
-              <w:rPr>
-                <w:rFonts w:ascii="Calibri" w:cs="Calibri" w:eastAsia="Calibri" w:hAnsi="Calibri"/>
-                <w:sz w:val="18"/>
-                <w:szCs w:val="18"/>
-              </w:rPr>
-              <w:t xml:space="preserve">15</w:t>
-            </w:r>
-          </w:p>
-        </w:tc>
-        <w:tc>
-          <w:tcPr>
-            <w:tcW w:type="dxa" w:w="1900"/>
-            <w:tcMar>
-              <w:top w:type="dxa" w:w="60"/>
-              <w:left w:type="dxa" w:w="90"/>
-              <w:bottom w:type="dxa" w:w="60"/>
-              <w:right w:type="dxa" w:w="90"/>
-            </w:tcMar>
-            <w:vAlign w:val="center"/>
-          </w:tcPr>
-          <w:p>
-            <w:pPr>
-              <w:spacing w:after="0" w:line="260"/>
-            </w:pPr>
-            <w:r>
-              <w:rPr>
-                <w:rFonts w:ascii="Calibri" w:cs="Calibri" w:eastAsia="Calibri" w:hAnsi="Calibri"/>
-                <w:sz w:val="18"/>
-                <w:szCs w:val="18"/>
-              </w:rPr>
-              <w:t xml:space="preserve">2026-10-12</w:t>
-            </w:r>
-          </w:p>
-        </w:tc>
-        <w:tc>
-          <w:tcPr>
-            <w:tcW w:type="dxa" w:w="1900"/>
-            <w:tcMar>
-              <w:top w:type="dxa" w:w="60"/>
-              <w:left w:type="dxa" w:w="90"/>
-              <w:bottom w:type="dxa" w:w="60"/>
-              <w:right w:type="dxa" w:w="90"/>
-            </w:tcMar>
-            <w:vAlign w:val="center"/>
-          </w:tcPr>
-          <w:p>
-            <w:pPr>
-              <w:spacing w:after="0" w:line="260"/>
-            </w:pPr>
-            <w:r>
-              <w:rPr>
-                <w:rFonts w:ascii="Calibri" w:cs="Calibri" w:eastAsia="Calibri" w:hAnsi="Calibri"/>
-                <w:sz w:val="18"/>
-                <w:szCs w:val="18"/>
-              </w:rPr>
-              <w:t xml:space="preserve">15:54:06</w:t>
-            </w:r>
-          </w:p>
-        </w:tc>
-        <w:tc>
-          <w:tcPr>
-            <w:tcW w:type="dxa" w:w="2300"/>
-            <w:tcMar>
-              <w:top w:type="dxa" w:w="60"/>
-              <w:left w:type="dxa" w:w="90"/>
-              <w:bottom w:type="dxa" w:w="60"/>
-              <w:right w:type="dxa" w:w="90"/>
-            </w:tcMar>
-            <w:vAlign w:val="center"/>
-          </w:tcPr>
-          <w:p>
-            <w:pPr>
-              <w:spacing w:after="0" w:line="260"/>
-            </w:pPr>
-            <w:r>
-              <w:rPr>
-                <w:rFonts w:ascii="Calibri" w:cs="Calibri" w:eastAsia="Calibri" w:hAnsi="Calibri"/>
-                <w:sz w:val="18"/>
-                <w:szCs w:val="18"/>
-              </w:rPr>
-              <w:t xml:space="preserve">8.423171</w:t>
-            </w:r>
-          </w:p>
-        </w:tc>
-        <w:tc>
-          <w:tcPr>
-            <w:tcW w:type="dxa" w:w="2300"/>
-            <w:tcMar>
-              <w:top w:type="dxa" w:w="60"/>
-              <w:left w:type="dxa" w:w="90"/>
-              <w:bottom w:type="dxa" w:w="60"/>
-              <w:right w:type="dxa" w:w="90"/>
-            </w:tcMar>
-            <w:vAlign w:val="center"/>
-          </w:tcPr>
-          <w:p>
-            <w:pPr>
-              <w:spacing w:after="0" w:line="260"/>
-            </w:pPr>
-            <w:r>
-              <w:rPr>
-                <w:rFonts w:ascii="Calibri" w:cs="Calibri" w:eastAsia="Calibri" w:hAnsi="Calibri"/>
-                <w:sz w:val="18"/>
-                <w:szCs w:val="18"/>
-              </w:rPr>
-              <w:t xml:space="preserve">-76.779608</w:t>
-            </w:r>
-          </w:p>
-        </w:tc>
-        <w:tc>
-          <w:tcPr>
-            <w:tcW w:type="dxa" w:w="1300"/>
-            <w:tcMar>
-              <w:top w:type="dxa" w:w="60"/>
-              <w:left w:type="dxa" w:w="90"/>
-              <w:bottom w:type="dxa" w:w="60"/>
-              <w:right w:type="dxa" w:w="90"/>
-            </w:tcMar>
-            <w:vAlign w:val="center"/>
-          </w:tcPr>
-          <w:p>
-            <w:pPr>
-              <w:spacing w:after="0" w:line="260"/>
-              <w:jc w:val="center"/>
-            </w:pPr>
-            <w:r>
-              <w:rPr>
-                <w:rFonts w:ascii="Calibri" w:cs="Calibri" w:eastAsia="Calibri" w:hAnsi="Calibri"/>
-                <w:sz w:val="18"/>
-                <w:szCs w:val="18"/>
-              </w:rPr>
-              <w:t xml:space="preserve">11</w:t>
             </w:r>
           </w:p>
         </w:tc>
@@ -8089,7 +7473,7 @@
           <w:sz w:val="22"/>
           <w:szCs w:val="22"/>
         </w:rPr>
-        <w:t xml:space="preserve">Archivo: </w:t>
+        <w:t xml:space="preserve">Archivo local: </w:t>
       </w:r>
       <w:r>
         <w:rPr>
@@ -8105,7 +7489,82 @@
           <w:sz w:val="22"/>
           <w:szCs w:val="22"/>
         </w:rPr>
-        <w:t xml:space="preserve"> (ábralo con doble clic en un navegador web; requiere conexión a internet para la imagen satelital y las panorámicas 360°). Integra recorridos, puntos GPS, fotografías georreferenciadas de celular y dron, y las vistas 360° de los dos sitios.</w:t>
+        <w:t xml:space="preserve"> (ábralo con doble clic en un navegador web; requiere conexión a internet para la imagen satelital y las panorámicas 360°). Integra recorridos, puntos GPS, fotografías georreferenciadas de celular y dron, selector de volcanes y las vistas 360° de los sitios.</w:t>
+      </w:r>
+    </w:p>
+    <w:p>
+      <w:pPr>
+        <w:spacing w:after="120" w:before="0" w:line="276"/>
+      </w:pPr>
+      <w:r>
+        <w:rPr>
+          <w:rFonts w:ascii="Calibri" w:cs="Calibri" w:eastAsia="Calibri" w:hAnsi="Calibri"/>
+          <w:b/>
+          <w:bCs/>
+          <w:sz w:val="22"/>
+          <w:szCs w:val="22"/>
+        </w:rPr>
+        <w:t xml:space="preserve">Visor en línea (GitHub Pages): </w:t>
+      </w:r>
+      <w:r>
+        <w:rPr>
+          <w:rFonts w:ascii="Calibri" w:cs="Calibri" w:eastAsia="Calibri" w:hAnsi="Calibri"/>
+          <w:color w:val="1F3864"/>
+          <w:sz w:val="22"/>
+          <w:szCs w:val="22"/>
+        </w:rPr>
+        <w:t xml:space="preserve">https://jorgealpala.github.io/diapirismolodo_golfouraba/VISOR_DIAPIRISMO.html</w:t>
+      </w:r>
+    </w:p>
+    <w:p>
+      <w:pPr>
+        <w:spacing w:after="120" w:before="0" w:line="276"/>
+      </w:pPr>
+      <w:r>
+        <w:rPr>
+          <w:rFonts w:ascii="Calibri" w:cs="Calibri" w:eastAsia="Calibri" w:hAnsi="Calibri"/>
+          <w:b/>
+          <w:bCs/>
+          <w:sz w:val="22"/>
+          <w:szCs w:val="22"/>
+        </w:rPr>
+        <w:t xml:space="preserve">Repositorio: </w:t>
+      </w:r>
+      <w:r>
+        <w:rPr>
+          <w:rFonts w:ascii="Calibri" w:cs="Calibri" w:eastAsia="Calibri" w:hAnsi="Calibri"/>
+          <w:color w:val="1F3864"/>
+          <w:sz w:val="22"/>
+          <w:szCs w:val="22"/>
+        </w:rPr>
+        <w:t xml:space="preserve">https://github.com/jorgealpala/diapirismolodo_golfouraba</w:t>
+      </w:r>
+    </w:p>
+    <w:p>
+      <w:pPr>
+        <w:spacing w:after="120" w:before="0" w:line="276"/>
+      </w:pPr>
+      <w:r>
+        <w:rPr>
+          <w:rFonts w:ascii="Calibri" w:cs="Calibri" w:eastAsia="Calibri" w:hAnsi="Calibri"/>
+          <w:b/>
+          <w:bCs/>
+          <w:color w:val="595959"/>
+          <w:sz w:val="22"/>
+          <w:szCs w:val="22"/>
+        </w:rPr>
+        <w:t xml:space="preserve">Nota: </w:t>
+      </w:r>
+      <w:r>
+        <w:rPr>
+          <w:rFonts w:ascii="Calibri" w:cs="Calibri" w:eastAsia="Calibri" w:hAnsi="Calibri"/>
+          <w:i/>
+          <w:iCs/>
+          <w:color w:val="595959"/>
+          <w:sz w:val="22"/>
+          <w:szCs w:val="22"/>
+        </w:rPr>
+        <w:t xml:space="preserve">en la versión en línea las fotografías se visualizan mediante miniaturas; las imágenes originales y los videos (≈5 GB) se conservan en el almacenamiento interno de la UNGRD-SCR por los límites de tamaño de la plataforma.</w:t>
       </w:r>
     </w:p>
     <w:sectPr>

</xml_diff>

<commit_message>
Memoria técnica: portada institucional con logo UNGRD y barras tricolor
- Logo UNGRD en la portada, barras tricolor (amarillo/azul/rojo) y color
  azul institucional (#1F3460); encabezado con línea dorada
- Portada actualizada a los tres volcanes

Co-Authored-By: Claude Opus 4.8 <noreply@anthropic.com>
</commit_message>
<xml_diff>
--- a/MEMORIA_TECNICA_DIAPIRISMO_URABA.docx
+++ b/MEMORIA_TECNICA_DIAPIRISMO_URABA.docx
@@ -4,8 +4,162 @@
   <w:body>
     <w:p>
       <w:pPr>
+        <w:spacing w:after="120"/>
+        <w:jc w:val="center"/>
+      </w:pPr>
+      <w:r>
+        <w:drawing>
+          <wp:inline distT="0" distB="0" distL="0" distR="0">
+            <wp:extent cx="3619500" cy="1457325"/>
+            <wp:effectExtent t="0" r="0" b="0" l="0"/>
+            <wp:docPr id="1" name="" descr="" title=""/>
+            <wp:cNvGraphicFramePr>
+              <a:graphicFrameLocks xmlns:a="http://schemas.openxmlformats.org/drawingml/2006/main" noChangeAspect="1"/>
+            </wp:cNvGraphicFramePr>
+            <a:graphic xmlns:a="http://schemas.openxmlformats.org/drawingml/2006/main">
+              <a:graphicData uri="http://schemas.openxmlformats.org/drawingml/2006/picture">
+                <pic:pic xmlns:pic="http://schemas.openxmlformats.org/drawingml/2006/picture">
+                  <pic:nvPicPr>
+                    <pic:cNvPr id="0" name="" descr=""/>
+                    <pic:cNvPicPr>
+                      <a:picLocks noChangeAspect="1" noChangeArrowheads="1"/>
+                    </pic:cNvPicPr>
+                  </pic:nvPicPr>
+                  <pic:blipFill>
+                    <a:blip r:embed="rId9" cstate="none"/>
+                    <a:srcRect/>
+                    <a:stretch>
+                      <a:fillRect/>
+                    </a:stretch>
+                  </pic:blipFill>
+                  <pic:spPr bwMode="auto">
+                    <a:xfrm>
+                      <a:off x="0" y="0"/>
+                      <a:ext cx="3619500" cy="1457325"/>
+                    </a:xfrm>
+                    <a:prstGeom prst="rect">
+                      <a:avLst/>
+                    </a:prstGeom>
+                  </pic:spPr>
+                </pic:pic>
+              </a:graphicData>
+            </a:graphic>
+          </wp:inline>
+        </w:drawing>
+      </w:r>
+    </w:p>
+    <w:tbl>
+      <w:tblPr>
+        <w:tblW w:type="dxa" w:w="10400"/>
+        <w:tblBorders>
+          <w:top w:val="none"/>
+          <w:left w:val="none"/>
+          <w:bottom w:val="none"/>
+          <w:right w:val="none"/>
+          <w:insideH w:val="none"/>
+          <w:insideV w:val="none"/>
+        </w:tblBorders>
+      </w:tblPr>
+      <w:tblGrid>
+        <w:gridCol w:w="3466"/>
+        <w:gridCol w:w="3467"/>
+        <w:gridCol w:w="3467"/>
+      </w:tblGrid>
+      <w:tr>
+        <w:trPr>
+          <w:trHeight w:val="90" w:hRule="exact"/>
+        </w:trPr>
+        <w:tc>
+          <w:tcPr>
+            <w:tcW w:type="dxa" w:w="3466"/>
+            <w:tcBorders>
+              <w:top w:val="none"/>
+              <w:left w:val="none"/>
+              <w:bottom w:val="none"/>
+              <w:right w:val="none"/>
+            </w:tcBorders>
+            <w:shd w:fill="FECC17" w:color="auto" w:val="clear"/>
+          </w:tcPr>
+          <w:p>
+            <w:pPr>
+              <w:spacing w:after="0" w:before="0"/>
+            </w:pPr>
+            <w:r>
+              <w:rPr>
+                <w:sz w:val="2"/>
+                <w:szCs w:val="2"/>
+              </w:rPr>
+              <w:t xml:space="preserve"> </w:t>
+            </w:r>
+          </w:p>
+        </w:tc>
+        <w:tc>
+          <w:tcPr>
+            <w:tcW w:type="dxa" w:w="3466"/>
+            <w:tcBorders>
+              <w:top w:val="none"/>
+              <w:left w:val="none"/>
+              <w:bottom w:val="none"/>
+              <w:right w:val="none"/>
+            </w:tcBorders>
+            <w:shd w:fill="1F3460" w:color="auto" w:val="clear"/>
+          </w:tcPr>
+          <w:p>
+            <w:pPr>
+              <w:spacing w:after="0" w:before="0"/>
+            </w:pPr>
+            <w:r>
+              <w:rPr>
+                <w:sz w:val="2"/>
+                <w:szCs w:val="2"/>
+              </w:rPr>
+              <w:t xml:space="preserve"> </w:t>
+            </w:r>
+          </w:p>
+        </w:tc>
+        <w:tc>
+          <w:tcPr>
+            <w:tcW w:type="dxa" w:w="3466"/>
+            <w:tcBorders>
+              <w:top w:val="none"/>
+              <w:left w:val="none"/>
+              <w:bottom w:val="none"/>
+              <w:right w:val="none"/>
+            </w:tcBorders>
+            <w:shd w:fill="D80C28" w:color="auto" w:val="clear"/>
+          </w:tcPr>
+          <w:p>
+            <w:pPr>
+              <w:spacing w:after="0" w:before="0"/>
+            </w:pPr>
+            <w:r>
+              <w:rPr>
+                <w:sz w:val="2"/>
+                <w:szCs w:val="2"/>
+              </w:rPr>
+              <w:t xml:space="preserve"> </w:t>
+            </w:r>
+          </w:p>
+        </w:tc>
+      </w:tr>
+    </w:tbl>
+    <w:p>
+      <w:pPr>
+        <w:spacing w:after="120" w:before="0" w:line="276"/>
+      </w:pPr>
+      <w:r>
+        <w:rPr>
+          <w:rFonts w:ascii="Calibri" w:cs="Calibri" w:eastAsia="Calibri" w:hAnsi="Calibri"/>
+          <w:sz w:val="8"/>
+          <w:szCs w:val="8"/>
+        </w:rPr>
+        <w:t xml:space="preserve"/>
+      </w:r>
+    </w:p>
+    <w:p>
+      <w:pPr>
         <w:pBdr>
-          <w:bottom w:val="single" w:color="1F3864" w:sz="12" w:space="6"/>
+          <w:bottom w:val="single" w:color="1F3460" w:sz="12" w:space="6"/>
         </w:pBdr>
         <w:spacing w:after="40"/>
       </w:pPr>
@@ -14,7 +168,7 @@
           <w:rFonts w:ascii="Calibri" w:cs="Calibri" w:eastAsia="Calibri" w:hAnsi="Calibri"/>
           <w:b/>
           <w:bCs/>
-          <w:color w:val="1F3864"/>
+          <w:color w:val="1F3460"/>
           <w:sz w:val="20"/>
           <w:szCs w:val="20"/>
         </w:rPr>
@@ -59,7 +213,7 @@
           <w:rFonts w:ascii="Calibri" w:cs="Calibri" w:eastAsia="Calibri" w:hAnsi="Calibri"/>
           <w:b/>
           <w:bCs/>
-          <w:color w:val="1F3864"/>
+          <w:color w:val="1F3460"/>
           <w:sz w:val="52"/>
           <w:szCs w:val="52"/>
         </w:rPr>
@@ -84,7 +238,7 @@
     </w:p>
     <w:p>
       <w:pPr>
-        <w:spacing w:after="60" w:before="0" w:line="276"/>
+        <w:spacing w:after="120" w:before="0" w:line="276"/>
         <w:jc w:val="center"/>
       </w:pPr>
       <w:r>
@@ -94,12 +248,107 @@
           <w:sz w:val="24"/>
           <w:szCs w:val="24"/>
         </w:rPr>
-        <w:t xml:space="preserve">Volcán Puerto López (Turbo) y El Volcán (Necoclí), departamento de Antioquia</w:t>
+        <w:t xml:space="preserve">Volcán Puerto López (Turbo), El Volcán y Volcán Las Changas (Necoclí), departamento de Antioquia</w:t>
       </w:r>
     </w:p>
+    <w:tbl>
+      <w:tblPr>
+        <w:tblW w:type="dxa" w:w="10400"/>
+        <w:tblBorders>
+          <w:top w:val="none"/>
+          <w:left w:val="none"/>
+          <w:bottom w:val="none"/>
+          <w:right w:val="none"/>
+          <w:insideH w:val="none"/>
+          <w:insideV w:val="none"/>
+        </w:tblBorders>
+      </w:tblPr>
+      <w:tblGrid>
+        <w:gridCol w:w="3466"/>
+        <w:gridCol w:w="3467"/>
+        <w:gridCol w:w="3467"/>
+      </w:tblGrid>
+      <w:tr>
+        <w:trPr>
+          <w:trHeight w:val="90" w:hRule="exact"/>
+        </w:trPr>
+        <w:tc>
+          <w:tcPr>
+            <w:tcW w:type="dxa" w:w="3466"/>
+            <w:tcBorders>
+              <w:top w:val="none"/>
+              <w:left w:val="none"/>
+              <w:bottom w:val="none"/>
+              <w:right w:val="none"/>
+            </w:tcBorders>
+            <w:shd w:fill="FECC17" w:color="auto" w:val="clear"/>
+          </w:tcPr>
+          <w:p>
+            <w:pPr>
+              <w:spacing w:after="0" w:before="0"/>
+            </w:pPr>
+            <w:r>
+              <w:rPr>
+                <w:sz w:val="2"/>
+                <w:szCs w:val="2"/>
+              </w:rPr>
+              <w:t xml:space="preserve"> </w:t>
+            </w:r>
+          </w:p>
+        </w:tc>
+        <w:tc>
+          <w:tcPr>
+            <w:tcW w:type="dxa" w:w="3466"/>
+            <w:tcBorders>
+              <w:top w:val="none"/>
+              <w:left w:val="none"/>
+              <w:bottom w:val="none"/>
+              <w:right w:val="none"/>
+            </w:tcBorders>
+            <w:shd w:fill="1F3460" w:color="auto" w:val="clear"/>
+          </w:tcPr>
+          <w:p>
+            <w:pPr>
+              <w:spacing w:after="0" w:before="0"/>
+            </w:pPr>
+            <w:r>
+              <w:rPr>
+                <w:sz w:val="2"/>
+                <w:szCs w:val="2"/>
+              </w:rPr>
+              <w:t xml:space="preserve"> </w:t>
+            </w:r>
+          </w:p>
+        </w:tc>
+        <w:tc>
+          <w:tcPr>
+            <w:tcW w:type="dxa" w:w="3466"/>
+            <w:tcBorders>
+              <w:top w:val="none"/>
+              <w:left w:val="none"/>
+              <w:bottom w:val="none"/>
+              <w:right w:val="none"/>
+            </w:tcBorders>
+            <w:shd w:fill="D80C28" w:color="auto" w:val="clear"/>
+          </w:tcPr>
+          <w:p>
+            <w:pPr>
+              <w:spacing w:after="0" w:before="0"/>
+            </w:pPr>
+            <w:r>
+              <w:rPr>
+                <w:sz w:val="2"/>
+                <w:szCs w:val="2"/>
+              </w:rPr>
+              <w:t xml:space="preserve"> </w:t>
+            </w:r>
+          </w:p>
+        </w:tc>
+      </w:tr>
+    </w:tbl>
     <w:p>
       <w:pPr>
-        <w:spacing w:after="500" w:before="0" w:line="276"/>
+        <w:spacing w:after="500" w:before="180" w:line="276"/>
         <w:jc w:val="center"/>
       </w:pPr>
       <w:r>
@@ -135,7 +384,7 @@
         <w:tc>
           <w:tcPr>
             <w:tcW w:type="dxa" w:w="3200"/>
-            <w:shd w:fill="1F3864" w:color="auto" w:val="clear"/>
+            <w:shd w:fill="1F3460" w:color="auto" w:val="clear"/>
             <w:tcMar>
               <w:top w:type="dxa" w:w="60"/>
               <w:left w:type="dxa" w:w="90"/>
@@ -164,7 +413,7 @@
         <w:tc>
           <w:tcPr>
             <w:tcW w:type="dxa" w:w="5400"/>
-            <w:shd w:fill="1F3864" w:color="auto" w:val="clear"/>
+            <w:shd w:fill="1F3460" w:color="auto" w:val="clear"/>
             <w:tcMar>
               <w:top w:type="dxa" w:w="60"/>
               <w:left w:type="dxa" w:w="90"/>
@@ -557,7 +806,7 @@
           <w:rFonts w:ascii="Calibri" w:cs="Calibri" w:eastAsia="Calibri" w:hAnsi="Calibri"/>
           <w:b/>
           <w:bCs/>
-          <w:color w:val="1F3864"/>
+          <w:color w:val="1F3460"/>
           <w:sz w:val="28"/>
           <w:szCs w:val="28"/>
         </w:rPr>
@@ -1207,7 +1456,7 @@
           <w:rFonts w:ascii="Calibri" w:cs="Calibri" w:eastAsia="Calibri" w:hAnsi="Calibri"/>
           <w:b/>
           <w:bCs/>
-          <w:color w:val="1F3864"/>
+          <w:color w:val="1F3460"/>
           <w:sz w:val="28"/>
           <w:szCs w:val="28"/>
         </w:rPr>
@@ -1252,7 +1501,7 @@
           <w:rFonts w:ascii="Calibri" w:cs="Calibri" w:eastAsia="Calibri" w:hAnsi="Calibri"/>
           <w:b/>
           <w:bCs/>
-          <w:color w:val="1F3864"/>
+          <w:color w:val="1F3460"/>
           <w:sz w:val="28"/>
           <w:szCs w:val="28"/>
         </w:rPr>
@@ -1397,7 +1646,7 @@
           <w:rFonts w:ascii="Calibri" w:cs="Calibri" w:eastAsia="Calibri" w:hAnsi="Calibri"/>
           <w:b/>
           <w:bCs/>
-          <w:color w:val="1F3864"/>
+          <w:color w:val="1F3460"/>
           <w:sz w:val="28"/>
           <w:szCs w:val="28"/>
         </w:rPr>
@@ -1539,7 +1788,7 @@
           <w:rFonts w:ascii="Calibri" w:cs="Calibri" w:eastAsia="Calibri" w:hAnsi="Calibri"/>
           <w:b/>
           <w:bCs/>
-          <w:color w:val="1F3864"/>
+          <w:color w:val="1F3460"/>
           <w:sz w:val="28"/>
           <w:szCs w:val="28"/>
         </w:rPr>
@@ -1610,7 +1859,7 @@
           <w:rFonts w:ascii="Calibri" w:cs="Calibri" w:eastAsia="Calibri" w:hAnsi="Calibri"/>
           <w:b/>
           <w:bCs/>
-          <w:color w:val="1F3864"/>
+          <w:color w:val="1F3460"/>
           <w:sz w:val="28"/>
           <w:szCs w:val="28"/>
         </w:rPr>
@@ -1656,7 +1905,7 @@
         <w:tc>
           <w:tcPr>
             <w:tcW w:type="dxa" w:w="2200"/>
-            <w:shd w:fill="1F3864" w:color="auto" w:val="clear"/>
+            <w:shd w:fill="1F3460" w:color="auto" w:val="clear"/>
             <w:tcMar>
               <w:top w:type="dxa" w:w="60"/>
               <w:left w:type="dxa" w:w="90"/>
@@ -1685,7 +1934,7 @@
         <w:tc>
           <w:tcPr>
             <w:tcW w:type="dxa" w:w="2750"/>
-            <w:shd w:fill="1F3864" w:color="auto" w:val="clear"/>
+            <w:shd w:fill="1F3460" w:color="auto" w:val="clear"/>
             <w:tcMar>
               <w:top w:type="dxa" w:w="60"/>
               <w:left w:type="dxa" w:w="90"/>
@@ -1714,7 +1963,7 @@
         <w:tc>
           <w:tcPr>
             <w:tcW w:type="dxa" w:w="2750"/>
-            <w:shd w:fill="1F3864" w:color="auto" w:val="clear"/>
+            <w:shd w:fill="1F3460" w:color="auto" w:val="clear"/>
             <w:tcMar>
               <w:top w:type="dxa" w:w="60"/>
               <w:left w:type="dxa" w:w="90"/>
@@ -1743,7 +1992,7 @@
         <w:tc>
           <w:tcPr>
             <w:tcW w:type="dxa" w:w="2700"/>
-            <w:shd w:fill="1F3864" w:color="auto" w:val="clear"/>
+            <w:shd w:fill="1F3460" w:color="auto" w:val="clear"/>
             <w:tcMar>
               <w:top w:type="dxa" w:w="60"/>
               <w:left w:type="dxa" w:w="90"/>
@@ -2443,7 +2692,7 @@
           <w:rFonts w:ascii="Calibri" w:cs="Calibri" w:eastAsia="Calibri" w:hAnsi="Calibri"/>
           <w:b/>
           <w:bCs/>
-          <w:color w:val="1F3864"/>
+          <w:color w:val="1F3460"/>
           <w:sz w:val="28"/>
           <w:szCs w:val="28"/>
         </w:rPr>
@@ -2669,7 +2918,7 @@
           <w:rFonts w:ascii="Calibri" w:cs="Calibri" w:eastAsia="Calibri" w:hAnsi="Calibri"/>
           <w:b/>
           <w:bCs/>
-          <w:color w:val="1F3864"/>
+          <w:color w:val="1F3460"/>
           <w:sz w:val="28"/>
           <w:szCs w:val="28"/>
         </w:rPr>
@@ -2735,7 +2984,7 @@
         <w:tc>
           <w:tcPr>
             <w:tcW w:type="dxa" w:w="4200"/>
-            <w:shd w:fill="1F3864" w:color="auto" w:val="clear"/>
+            <w:shd w:fill="1F3460" w:color="auto" w:val="clear"/>
             <w:tcMar>
               <w:top w:type="dxa" w:w="60"/>
               <w:left w:type="dxa" w:w="90"/>
@@ -2764,7 +3013,7 @@
         <w:tc>
           <w:tcPr>
             <w:tcW w:type="dxa" w:w="6200"/>
-            <w:shd w:fill="1F3864" w:color="auto" w:val="clear"/>
+            <w:shd w:fill="1F3460" w:color="auto" w:val="clear"/>
             <w:tcMar>
               <w:top w:type="dxa" w:w="60"/>
               <w:left w:type="dxa" w:w="90"/>
@@ -3100,7 +3349,7 @@
           <w:rFonts w:ascii="Calibri" w:cs="Calibri" w:eastAsia="Calibri" w:hAnsi="Calibri"/>
           <w:b/>
           <w:bCs/>
-          <w:color w:val="1F3864"/>
+          <w:color w:val="1F3460"/>
           <w:sz w:val="22"/>
           <w:szCs w:val="22"/>
         </w:rPr>
@@ -3250,7 +3499,7 @@
         <w:tc>
           <w:tcPr>
             <w:tcW w:type="dxa" w:w="4200"/>
-            <w:shd w:fill="1F3864" w:color="auto" w:val="clear"/>
+            <w:shd w:fill="1F3460" w:color="auto" w:val="clear"/>
             <w:tcMar>
               <w:top w:type="dxa" w:w="60"/>
               <w:left w:type="dxa" w:w="90"/>
@@ -3279,7 +3528,7 @@
         <w:tc>
           <w:tcPr>
             <w:tcW w:type="dxa" w:w="6200"/>
-            <w:shd w:fill="1F3864" w:color="auto" w:val="clear"/>
+            <w:shd w:fill="1F3460" w:color="auto" w:val="clear"/>
             <w:tcMar>
               <w:top w:type="dxa" w:w="60"/>
               <w:left w:type="dxa" w:w="90"/>
@@ -3615,7 +3864,7 @@
           <w:rFonts w:ascii="Calibri" w:cs="Calibri" w:eastAsia="Calibri" w:hAnsi="Calibri"/>
           <w:b/>
           <w:bCs/>
-          <w:color w:val="1F3864"/>
+          <w:color w:val="1F3460"/>
           <w:sz w:val="22"/>
           <w:szCs w:val="22"/>
         </w:rPr>
@@ -3765,7 +4014,7 @@
         <w:tc>
           <w:tcPr>
             <w:tcW w:type="dxa" w:w="4200"/>
-            <w:shd w:fill="1F3864" w:color="auto" w:val="clear"/>
+            <w:shd w:fill="1F3460" w:color="auto" w:val="clear"/>
             <w:tcMar>
               <w:top w:type="dxa" w:w="60"/>
               <w:left w:type="dxa" w:w="90"/>
@@ -3794,7 +4043,7 @@
         <w:tc>
           <w:tcPr>
             <w:tcW w:type="dxa" w:w="6200"/>
-            <w:shd w:fill="1F3864" w:color="auto" w:val="clear"/>
+            <w:shd w:fill="1F3460" w:color="auto" w:val="clear"/>
             <w:tcMar>
               <w:top w:type="dxa" w:w="60"/>
               <w:left w:type="dxa" w:w="90"/>
@@ -4130,7 +4379,7 @@
           <w:rFonts w:ascii="Calibri" w:cs="Calibri" w:eastAsia="Calibri" w:hAnsi="Calibri"/>
           <w:b/>
           <w:bCs/>
-          <w:color w:val="1F3864"/>
+          <w:color w:val="1F3460"/>
           <w:sz w:val="22"/>
           <w:szCs w:val="22"/>
         </w:rPr>
@@ -4233,7 +4482,7 @@
           <w:rFonts w:ascii="Calibri" w:cs="Calibri" w:eastAsia="Calibri" w:hAnsi="Calibri"/>
           <w:b/>
           <w:bCs/>
-          <w:color w:val="1F3864"/>
+          <w:color w:val="1F3460"/>
           <w:sz w:val="28"/>
           <w:szCs w:val="28"/>
         </w:rPr>
@@ -4296,7 +4545,7 @@
           <w:rFonts w:ascii="Calibri" w:cs="Calibri" w:eastAsia="Calibri" w:hAnsi="Calibri"/>
           <w:b/>
           <w:bCs/>
-          <w:color w:val="1F3864"/>
+          <w:color w:val="1F3460"/>
           <w:sz w:val="28"/>
           <w:szCs w:val="28"/>
         </w:rPr>
@@ -4346,7 +4595,7 @@
           <w:rFonts w:ascii="Calibri" w:cs="Calibri" w:eastAsia="Calibri" w:hAnsi="Calibri"/>
           <w:b/>
           <w:bCs/>
-          <w:color w:val="1F3864"/>
+          <w:color w:val="1F3460"/>
           <w:sz w:val="28"/>
           <w:szCs w:val="28"/>
         </w:rPr>
@@ -4396,7 +4645,7 @@
           <w:rFonts w:ascii="Calibri" w:cs="Calibri" w:eastAsia="Calibri" w:hAnsi="Calibri"/>
           <w:b/>
           <w:bCs/>
-          <w:color w:val="1F3864"/>
+          <w:color w:val="1F3460"/>
           <w:sz w:val="28"/>
           <w:szCs w:val="28"/>
         </w:rPr>
@@ -4449,7 +4698,7 @@
         <w:tc>
           <w:tcPr>
             <w:tcW w:type="dxa" w:w="2900"/>
-            <w:shd w:fill="1F3864" w:color="auto" w:val="clear"/>
+            <w:shd w:fill="1F3460" w:color="auto" w:val="clear"/>
             <w:tcMar>
               <w:top w:type="dxa" w:w="60"/>
               <w:left w:type="dxa" w:w="90"/>
@@ -4478,7 +4727,7 @@
         <w:tc>
           <w:tcPr>
             <w:tcW w:type="dxa" w:w="1800"/>
-            <w:shd w:fill="1F3864" w:color="auto" w:val="clear"/>
+            <w:shd w:fill="1F3460" w:color="auto" w:val="clear"/>
             <w:tcMar>
               <w:top w:type="dxa" w:w="60"/>
               <w:left w:type="dxa" w:w="90"/>
@@ -4507,7 +4756,7 @@
         <w:tc>
           <w:tcPr>
             <w:tcW w:type="dxa" w:w="1700"/>
-            <w:shd w:fill="1F3864" w:color="auto" w:val="clear"/>
+            <w:shd w:fill="1F3460" w:color="auto" w:val="clear"/>
             <w:tcMar>
               <w:top w:type="dxa" w:w="60"/>
               <w:left w:type="dxa" w:w="90"/>
@@ -4536,7 +4785,7 @@
         <w:tc>
           <w:tcPr>
             <w:tcW w:type="dxa" w:w="1900"/>
-            <w:shd w:fill="1F3864" w:color="auto" w:val="clear"/>
+            <w:shd w:fill="1F3460" w:color="auto" w:val="clear"/>
             <w:tcMar>
               <w:top w:type="dxa" w:w="60"/>
               <w:left w:type="dxa" w:w="90"/>
@@ -4565,7 +4814,7 @@
         <w:tc>
           <w:tcPr>
             <w:tcW w:type="dxa" w:w="2100"/>
-            <w:shd w:fill="1F3864" w:color="auto" w:val="clear"/>
+            <w:shd w:fill="1F3460" w:color="auto" w:val="clear"/>
             <w:tcMar>
               <w:top w:type="dxa" w:w="60"/>
               <w:left w:type="dxa" w:w="90"/>
@@ -5536,7 +5785,7 @@
         <w:tc>
           <w:tcPr>
             <w:tcW w:type="dxa" w:w="700"/>
-            <w:shd w:fill="1F3864" w:color="auto" w:val="clear"/>
+            <w:shd w:fill="1F3460" w:color="auto" w:val="clear"/>
             <w:tcMar>
               <w:top w:type="dxa" w:w="60"/>
               <w:left w:type="dxa" w:w="90"/>
@@ -5565,7 +5814,7 @@
         <w:tc>
           <w:tcPr>
             <w:tcW w:type="dxa" w:w="1900"/>
-            <w:shd w:fill="1F3864" w:color="auto" w:val="clear"/>
+            <w:shd w:fill="1F3460" w:color="auto" w:val="clear"/>
             <w:tcMar>
               <w:top w:type="dxa" w:w="60"/>
               <w:left w:type="dxa" w:w="90"/>
@@ -5594,7 +5843,7 @@
         <w:tc>
           <w:tcPr>
             <w:tcW w:type="dxa" w:w="1900"/>
-            <w:shd w:fill="1F3864" w:color="auto" w:val="clear"/>
+            <w:shd w:fill="1F3460" w:color="auto" w:val="clear"/>
             <w:tcMar>
               <w:top w:type="dxa" w:w="60"/>
               <w:left w:type="dxa" w:w="90"/>
@@ -5623,7 +5872,7 @@
         <w:tc>
           <w:tcPr>
             <w:tcW w:type="dxa" w:w="2300"/>
-            <w:shd w:fill="1F3864" w:color="auto" w:val="clear"/>
+            <w:shd w:fill="1F3460" w:color="auto" w:val="clear"/>
             <w:tcMar>
               <w:top w:type="dxa" w:w="60"/>
               <w:left w:type="dxa" w:w="90"/>
@@ -5652,7 +5901,7 @@
         <w:tc>
           <w:tcPr>
             <w:tcW w:type="dxa" w:w="2300"/>
-            <w:shd w:fill="1F3864" w:color="auto" w:val="clear"/>
+            <w:shd w:fill="1F3460" w:color="auto" w:val="clear"/>
             <w:tcMar>
               <w:top w:type="dxa" w:w="60"/>
               <w:left w:type="dxa" w:w="90"/>
@@ -5681,7 +5930,7 @@
         <w:tc>
           <w:tcPr>
             <w:tcW w:type="dxa" w:w="1300"/>
-            <w:shd w:fill="1F3864" w:color="auto" w:val="clear"/>
+            <w:shd w:fill="1F3460" w:color="auto" w:val="clear"/>
             <w:tcMar>
               <w:top w:type="dxa" w:w="60"/>
               <w:left w:type="dxa" w:w="90"/>
@@ -6217,7 +6466,7 @@
         <w:tc>
           <w:tcPr>
             <w:tcW w:type="dxa" w:w="700"/>
-            <w:shd w:fill="1F3864" w:color="auto" w:val="clear"/>
+            <w:shd w:fill="1F3460" w:color="auto" w:val="clear"/>
             <w:tcMar>
               <w:top w:type="dxa" w:w="60"/>
               <w:left w:type="dxa" w:w="90"/>
@@ -6246,7 +6495,7 @@
         <w:tc>
           <w:tcPr>
             <w:tcW w:type="dxa" w:w="1900"/>
-            <w:shd w:fill="1F3864" w:color="auto" w:val="clear"/>
+            <w:shd w:fill="1F3460" w:color="auto" w:val="clear"/>
             <w:tcMar>
               <w:top w:type="dxa" w:w="60"/>
               <w:left w:type="dxa" w:w="90"/>
@@ -6275,7 +6524,7 @@
         <w:tc>
           <w:tcPr>
             <w:tcW w:type="dxa" w:w="1900"/>
-            <w:shd w:fill="1F3864" w:color="auto" w:val="clear"/>
+            <w:shd w:fill="1F3460" w:color="auto" w:val="clear"/>
             <w:tcMar>
               <w:top w:type="dxa" w:w="60"/>
               <w:left w:type="dxa" w:w="90"/>
@@ -6304,7 +6553,7 @@
         <w:tc>
           <w:tcPr>
             <w:tcW w:type="dxa" w:w="2300"/>
-            <w:shd w:fill="1F3864" w:color="auto" w:val="clear"/>
+            <w:shd w:fill="1F3460" w:color="auto" w:val="clear"/>
             <w:tcMar>
               <w:top w:type="dxa" w:w="60"/>
               <w:left w:type="dxa" w:w="90"/>
@@ -6333,7 +6582,7 @@
         <w:tc>
           <w:tcPr>
             <w:tcW w:type="dxa" w:w="2300"/>
-            <w:shd w:fill="1F3864" w:color="auto" w:val="clear"/>
+            <w:shd w:fill="1F3460" w:color="auto" w:val="clear"/>
             <w:tcMar>
               <w:top w:type="dxa" w:w="60"/>
               <w:left w:type="dxa" w:w="90"/>
@@ -6362,7 +6611,7 @@
         <w:tc>
           <w:tcPr>
             <w:tcW w:type="dxa" w:w="1300"/>
-            <w:shd w:fill="1F3864" w:color="auto" w:val="clear"/>
+            <w:shd w:fill="1F3460" w:color="auto" w:val="clear"/>
             <w:tcMar>
               <w:top w:type="dxa" w:w="60"/>
               <w:left w:type="dxa" w:w="90"/>
@@ -8438,7 +8687,7 @@
         <w:tc>
           <w:tcPr>
             <w:tcW w:type="dxa" w:w="700"/>
-            <w:shd w:fill="1F3864" w:color="auto" w:val="clear"/>
+            <w:shd w:fill="1F3460" w:color="auto" w:val="clear"/>
             <w:tcMar>
               <w:top w:type="dxa" w:w="60"/>
               <w:left w:type="dxa" w:w="90"/>
@@ -8467,7 +8716,7 @@
         <w:tc>
           <w:tcPr>
             <w:tcW w:type="dxa" w:w="1900"/>
-            <w:shd w:fill="1F3864" w:color="auto" w:val="clear"/>
+            <w:shd w:fill="1F3460" w:color="auto" w:val="clear"/>
             <w:tcMar>
               <w:top w:type="dxa" w:w="60"/>
               <w:left w:type="dxa" w:w="90"/>
@@ -8496,7 +8745,7 @@
         <w:tc>
           <w:tcPr>
             <w:tcW w:type="dxa" w:w="1900"/>
-            <w:shd w:fill="1F3864" w:color="auto" w:val="clear"/>
+            <w:shd w:fill="1F3460" w:color="auto" w:val="clear"/>
             <w:tcMar>
               <w:top w:type="dxa" w:w="60"/>
               <w:left w:type="dxa" w:w="90"/>
@@ -8525,7 +8774,7 @@
         <w:tc>
           <w:tcPr>
             <w:tcW w:type="dxa" w:w="2300"/>
-            <w:shd w:fill="1F3864" w:color="auto" w:val="clear"/>
+            <w:shd w:fill="1F3460" w:color="auto" w:val="clear"/>
             <w:tcMar>
               <w:top w:type="dxa" w:w="60"/>
               <w:left w:type="dxa" w:w="90"/>
@@ -8554,7 +8803,7 @@
         <w:tc>
           <w:tcPr>
             <w:tcW w:type="dxa" w:w="2300"/>
-            <w:shd w:fill="1F3864" w:color="auto" w:val="clear"/>
+            <w:shd w:fill="1F3460" w:color="auto" w:val="clear"/>
             <w:tcMar>
               <w:top w:type="dxa" w:w="60"/>
               <w:left w:type="dxa" w:w="90"/>
@@ -8583,7 +8832,7 @@
         <w:tc>
           <w:tcPr>
             <w:tcW w:type="dxa" w:w="1300"/>
-            <w:shd w:fill="1F3864" w:color="auto" w:val="clear"/>
+            <w:shd w:fill="1F3460" w:color="auto" w:val="clear"/>
             <w:tcMar>
               <w:top w:type="dxa" w:w="60"/>
               <w:left w:type="dxa" w:w="90"/>
@@ -12883,7 +13132,7 @@
   <w:p>
     <w:pPr>
       <w:pBdr>
-        <w:bottom w:val="single" w:color="BFBFBF" w:sz="4" w:space="4"/>
+        <w:bottom w:val="single" w:color="FECC17" w:sz="8" w:space="4"/>
       </w:pBdr>
       <w:spacing w:after="0"/>
       <w:jc w:val="right"/>
@@ -12891,7 +13140,9 @@
     <w:r>
       <w:rPr>
         <w:rFonts w:ascii="Calibri" w:cs="Calibri" w:eastAsia="Calibri" w:hAnsi="Calibri"/>
-        <w:color w:val="595959"/>
+        <w:b/>
+        <w:bCs/>
+        <w:color w:val="1F3460"/>
         <w:sz w:val="16"/>
         <w:szCs w:val="16"/>
       </w:rPr>

</xml_diff>